<commit_message>
Test plans: rewritten to the professor's notes
Unit plan: every check opens with a happy case and then its sad cases;
the description says what the user does; a sad case's expected result
gives the Problem and then the Solution. Checks moved to the right type
(password length, price, dates and limits are Range; a wrong password,
an unknown barcode or a used SKU are Database; two passwords that must
match are Consistency). Only the Administrator, Cashier and Supplier.

System plan: one path in screen order, from Sign in to each role's home
page, through the sidebar in order, ending with Logout; button names as
on the screens.

UAT: each role's script runs in order from signing in to logging out, and
every sad case has its solution. Every quoted message was checked against
the code.

Co-Authored-By: Claude Opus 5.5 <noreply@anthropic.com>
</commit_message>
<xml_diff>
--- a/QA/FETCH-UAT-Cashier.docx
+++ b/QA/FETCH-UAT-Cashier.docx
@@ -368,7 +368,7 @@
                 <w:sz w:val="16"/>
                 <w:szCs w:val="16"/>
               </w:rPr>
-              <w:t xml:space="preserve">Cashier (26 test cases: 7 happy, 19 sad)</w:t>
+              <w:t xml:space="preserve">Cashier (26 test cases: 8 happy, 18 sad)</w:t>
             </w:r>
           </w:p>
         </w:tc>
@@ -476,7 +476,7 @@
                 <w:sz w:val="16"/>
                 <w:szCs w:val="16"/>
               </w:rPr>
-              <w:t xml:space="preserve">Date:</w:t>
+              <w:t xml:space="preserve">Project Manager:</w:t>
             </w:r>
           </w:p>
         </w:tc>
@@ -509,7 +509,7 @@
                 <w:sz w:val="16"/>
                 <w:szCs w:val="16"/>
               </w:rPr>
-              <w:t xml:space="preserve"/>
+              <w:t xml:space="preserve">Juan Carlo Reusora and Joylinda Jugan</w:t>
             </w:r>
           </w:p>
         </w:tc>
@@ -616,7 +616,7 @@
                 <w:sz w:val="16"/>
                 <w:szCs w:val="16"/>
               </w:rPr>
-              <w:t xml:space="preserve">Project Manager:</w:t>
+              <w:t xml:space="preserve">Date:</w:t>
             </w:r>
           </w:p>
         </w:tc>
@@ -649,7 +649,7 @@
                 <w:sz w:val="16"/>
                 <w:szCs w:val="16"/>
               </w:rPr>
-              <w:t xml:space="preserve">Juan Carlo Reusora and Joylinda Jugan</w:t>
+              <w:t xml:space="preserve"/>
             </w:r>
           </w:p>
         </w:tc>
@@ -1261,7 +1261,7 @@
                 <w:sz w:val="18"/>
                 <w:szCs w:val="18"/>
               </w:rPr>
-              <w:t xml:space="preserve">1.  SIGN IN</w:t>
+              <w:t xml:space="preserve">STEP 1: SIGN IN</w:t>
             </w:r>
           </w:p>
         </w:tc>
@@ -1434,7 +1434,7 @@
                 <w:sz w:val="16"/>
                 <w:szCs w:val="16"/>
               </w:rPr>
-              <w:t xml:space="preserve">On the Sign in page, enter the cashier's username and password, then click Sign in</w:t>
+              <w:t xml:space="preserve">Open FETCH, enter the cashier's username and password, then click Sign in</w:t>
             </w:r>
           </w:p>
         </w:tc>
@@ -1739,7 +1739,7 @@
                 <w:sz w:val="16"/>
                 <w:szCs w:val="16"/>
               </w:rPr>
-              <w:t xml:space="preserve">Enter the cashier's username with a wrong password, then click Sign in</w:t>
+              <w:t xml:space="preserve">Enter the username with a wrong password, then click Sign in</w:t>
             </w:r>
           </w:p>
         </w:tc>
@@ -1762,17 +1762,50 @@
           </w:tcPr>
           <w:p>
             <w:pPr>
-              <w:spacing w:after="0" w:line="230"/>
-              <w:jc w:val="left"/>
-            </w:pPr>
-            <w:r>
-              <w:rPr>
-                <w:rFonts w:ascii="Arial" w:cs="Arial" w:eastAsia="Arial" w:hAnsi="Arial"/>
-                <w:color w:val="000000"/>
-                <w:sz w:val="16"/>
-                <w:szCs w:val="16"/>
-              </w:rPr>
-              <w:t xml:space="preserve">A message "Invalid username or password" is displayed and the user stays on the Sign in page</w:t>
+              <w:spacing w:after="60" w:line="230"/>
+              <w:jc w:val="left"/>
+            </w:pPr>
+            <w:r>
+              <w:rPr>
+                <w:rFonts w:ascii="Arial" w:cs="Arial" w:eastAsia="Arial" w:hAnsi="Arial"/>
+                <w:b/>
+                <w:bCs/>
+                <w:sz w:val="16"/>
+                <w:szCs w:val="16"/>
+              </w:rPr>
+              <w:t xml:space="preserve">Problem: </w:t>
+            </w:r>
+            <w:r>
+              <w:rPr>
+                <w:rFonts w:ascii="Arial" w:cs="Arial" w:eastAsia="Arial" w:hAnsi="Arial"/>
+                <w:sz w:val="16"/>
+                <w:szCs w:val="16"/>
+              </w:rPr>
+              <w:t xml:space="preserve">A message "Invalid username or password" is displayed</w:t>
+            </w:r>
+          </w:p>
+          <w:p>
+            <w:pPr>
+              <w:spacing w:after="0" w:line="230"/>
+              <w:jc w:val="left"/>
+            </w:pPr>
+            <w:r>
+              <w:rPr>
+                <w:rFonts w:ascii="Arial" w:cs="Arial" w:eastAsia="Arial" w:hAnsi="Arial"/>
+                <w:b/>
+                <w:bCs/>
+                <w:sz w:val="16"/>
+                <w:szCs w:val="16"/>
+              </w:rPr>
+              <w:t xml:space="preserve">Solution: </w:t>
+            </w:r>
+            <w:r>
+              <w:rPr>
+                <w:rFonts w:ascii="Arial" w:cs="Arial" w:eastAsia="Arial" w:hAnsi="Arial"/>
+                <w:sz w:val="16"/>
+                <w:szCs w:val="16"/>
+              </w:rPr>
+              <w:t xml:space="preserve">Type the correct password, or ask the administrator to reset it</w:t>
             </w:r>
           </w:p>
         </w:tc>
@@ -2044,7 +2077,7 @@
                 <w:sz w:val="16"/>
                 <w:szCs w:val="16"/>
               </w:rPr>
-              <w:t xml:space="preserve">While signed in as cashier, type the address of the Inventory page (inventory.html)</w:t>
+              <w:t xml:space="preserve">While signed in, type the address of the Inventory page (inventory.html)</w:t>
             </w:r>
           </w:p>
         </w:tc>
@@ -2067,17 +2100,50 @@
           </w:tcPr>
           <w:p>
             <w:pPr>
-              <w:spacing w:after="0" w:line="230"/>
-              <w:jc w:val="left"/>
-            </w:pPr>
-            <w:r>
-              <w:rPr>
-                <w:rFonts w:ascii="Arial" w:cs="Arial" w:eastAsia="Arial" w:hAnsi="Arial"/>
-                <w:color w:val="000000"/>
-                <w:sz w:val="16"/>
-                <w:szCs w:val="16"/>
-              </w:rPr>
-              <w:t xml:space="preserve">Inventory does not open: the cashier is taken back to the Point of Sale</w:t>
+              <w:spacing w:after="60" w:line="230"/>
+              <w:jc w:val="left"/>
+            </w:pPr>
+            <w:r>
+              <w:rPr>
+                <w:rFonts w:ascii="Arial" w:cs="Arial" w:eastAsia="Arial" w:hAnsi="Arial"/>
+                <w:b/>
+                <w:bCs/>
+                <w:sz w:val="16"/>
+                <w:szCs w:val="16"/>
+              </w:rPr>
+              <w:t xml:space="preserve">Problem: </w:t>
+            </w:r>
+            <w:r>
+              <w:rPr>
+                <w:rFonts w:ascii="Arial" w:cs="Arial" w:eastAsia="Arial" w:hAnsi="Arial"/>
+                <w:sz w:val="16"/>
+                <w:szCs w:val="16"/>
+              </w:rPr>
+              <w:t xml:space="preserve">Inventory does not open: the cashier is returned to the Point of Sale</w:t>
+            </w:r>
+          </w:p>
+          <w:p>
+            <w:pPr>
+              <w:spacing w:after="0" w:line="230"/>
+              <w:jc w:val="left"/>
+            </w:pPr>
+            <w:r>
+              <w:rPr>
+                <w:rFonts w:ascii="Arial" w:cs="Arial" w:eastAsia="Arial" w:hAnsi="Arial"/>
+                <w:b/>
+                <w:bCs/>
+                <w:sz w:val="16"/>
+                <w:szCs w:val="16"/>
+              </w:rPr>
+              <w:t xml:space="preserve">Solution: </w:t>
+            </w:r>
+            <w:r>
+              <w:rPr>
+                <w:rFonts w:ascii="Arial" w:cs="Arial" w:eastAsia="Arial" w:hAnsi="Arial"/>
+                <w:sz w:val="16"/>
+                <w:szCs w:val="16"/>
+              </w:rPr>
+              <w:t xml:space="preserve">No action: Inventory is for the administrator</w:t>
             </w:r>
           </w:p>
         </w:tc>
@@ -2218,7 +2284,7 @@
                 <w:sz w:val="18"/>
                 <w:szCs w:val="18"/>
               </w:rPr>
-              <w:t xml:space="preserve">2.  STARTING CASH</w:t>
+              <w:t xml:space="preserve">STEP 2: STARTING CASH</w:t>
             </w:r>
           </w:p>
         </w:tc>
@@ -2719,17 +2785,50 @@
           </w:tcPr>
           <w:p>
             <w:pPr>
-              <w:spacing w:after="0" w:line="230"/>
-              <w:jc w:val="left"/>
-            </w:pPr>
-            <w:r>
-              <w:rPr>
-                <w:rFonts w:ascii="Arial" w:cs="Arial" w:eastAsia="Arial" w:hAnsi="Arial"/>
-                <w:color w:val="000000"/>
+              <w:spacing w:after="60" w:line="230"/>
+              <w:jc w:val="left"/>
+            </w:pPr>
+            <w:r>
+              <w:rPr>
+                <w:rFonts w:ascii="Arial" w:cs="Arial" w:eastAsia="Arial" w:hAnsi="Arial"/>
+                <w:b/>
+                <w:bCs/>
+                <w:sz w:val="16"/>
+                <w:szCs w:val="16"/>
+              </w:rPr>
+              <w:t xml:space="preserve">Problem: </w:t>
+            </w:r>
+            <w:r>
+              <w:rPr>
+                <w:rFonts w:ascii="Arial" w:cs="Arial" w:eastAsia="Arial" w:hAnsi="Arial"/>
                 <w:sz w:val="16"/>
                 <w:szCs w:val="16"/>
               </w:rPr>
               <w:t xml:space="preserve">A message "Enter the cash in the drawer, or 0 if it is empty" is displayed</w:t>
+            </w:r>
+          </w:p>
+          <w:p>
+            <w:pPr>
+              <w:spacing w:after="0" w:line="230"/>
+              <w:jc w:val="left"/>
+            </w:pPr>
+            <w:r>
+              <w:rPr>
+                <w:rFonts w:ascii="Arial" w:cs="Arial" w:eastAsia="Arial" w:hAnsi="Arial"/>
+                <w:b/>
+                <w:bCs/>
+                <w:sz w:val="16"/>
+                <w:szCs w:val="16"/>
+              </w:rPr>
+              <w:t xml:space="preserve">Solution: </w:t>
+            </w:r>
+            <w:r>
+              <w:rPr>
+                <w:rFonts w:ascii="Arial" w:cs="Arial" w:eastAsia="Arial" w:hAnsi="Arial"/>
+                <w:sz w:val="16"/>
+                <w:szCs w:val="16"/>
+              </w:rPr>
+              <w:t xml:space="preserve">Count the drawer and type the amount, or 0</w:t>
             </w:r>
           </w:p>
         </w:tc>
@@ -2870,7 +2969,7 @@
                 <w:sz w:val="18"/>
                 <w:szCs w:val="18"/>
               </w:rPr>
-              <w:t xml:space="preserve">3.  ADD TO CART</w:t>
+              <w:t xml:space="preserve">STEP 3: ADD TO CART</w:t>
             </w:r>
           </w:p>
         </w:tc>
@@ -3076,7 +3175,7 @@
                 <w:sz w:val="16"/>
                 <w:szCs w:val="16"/>
               </w:rPr>
-              <w:t xml:space="preserve">A message "(product) added to cart" is displayed and the product is in the Current sale</w:t>
+              <w:t xml:space="preserve">A message "(product) added to cart" is displayed and it is in the Current sale</w:t>
             </w:r>
           </w:p>
         </w:tc>
@@ -3348,7 +3447,7 @@
                 <w:sz w:val="16"/>
                 <w:szCs w:val="16"/>
               </w:rPr>
-              <w:t xml:space="preserve">Scan or type a barcode that is not in the system</w:t>
+              <w:t xml:space="preserve">Scan or type a barcode that is not on record</w:t>
             </w:r>
           </w:p>
         </w:tc>
@@ -3371,17 +3470,50 @@
           </w:tcPr>
           <w:p>
             <w:pPr>
-              <w:spacing w:after="0" w:line="230"/>
-              <w:jc w:val="left"/>
-            </w:pPr>
-            <w:r>
-              <w:rPr>
-                <w:rFonts w:ascii="Arial" w:cs="Arial" w:eastAsia="Arial" w:hAnsi="Arial"/>
-                <w:color w:val="000000"/>
+              <w:spacing w:after="60" w:line="230"/>
+              <w:jc w:val="left"/>
+            </w:pPr>
+            <w:r>
+              <w:rPr>
+                <w:rFonts w:ascii="Arial" w:cs="Arial" w:eastAsia="Arial" w:hAnsi="Arial"/>
+                <w:b/>
+                <w:bCs/>
+                <w:sz w:val="16"/>
+                <w:szCs w:val="16"/>
+              </w:rPr>
+              <w:t xml:space="preserve">Problem: </w:t>
+            </w:r>
+            <w:r>
+              <w:rPr>
+                <w:rFonts w:ascii="Arial" w:cs="Arial" w:eastAsia="Arial" w:hAnsi="Arial"/>
                 <w:sz w:val="16"/>
                 <w:szCs w:val="16"/>
               </w:rPr>
               <w:t xml:space="preserve">A message "No product found for "(barcode)"" is displayed</w:t>
+            </w:r>
+          </w:p>
+          <w:p>
+            <w:pPr>
+              <w:spacing w:after="0" w:line="230"/>
+              <w:jc w:val="left"/>
+            </w:pPr>
+            <w:r>
+              <w:rPr>
+                <w:rFonts w:ascii="Arial" w:cs="Arial" w:eastAsia="Arial" w:hAnsi="Arial"/>
+                <w:b/>
+                <w:bCs/>
+                <w:sz w:val="16"/>
+                <w:szCs w:val="16"/>
+              </w:rPr>
+              <w:t xml:space="preserve">Solution: </w:t>
+            </w:r>
+            <w:r>
+              <w:rPr>
+                <w:rFonts w:ascii="Arial" w:cs="Arial" w:eastAsia="Arial" w:hAnsi="Arial"/>
+                <w:sz w:val="16"/>
+                <w:szCs w:val="16"/>
+              </w:rPr>
+              <w:t xml:space="preserve">Scan again or search the product by name; tell the administrator to add the barcode</w:t>
             </w:r>
           </w:p>
         </w:tc>
@@ -3676,17 +3808,50 @@
           </w:tcPr>
           <w:p>
             <w:pPr>
-              <w:spacing w:after="0" w:line="230"/>
-              <w:jc w:val="left"/>
-            </w:pPr>
-            <w:r>
-              <w:rPr>
-                <w:rFonts w:ascii="Arial" w:cs="Arial" w:eastAsia="Arial" w:hAnsi="Arial"/>
-                <w:color w:val="000000"/>
-                <w:sz w:val="16"/>
-                <w:szCs w:val="16"/>
-              </w:rPr>
-              <w:t xml:space="preserve">A message "(product) has expired and cannot be sold" is displayed and nothing is added</w:t>
+              <w:spacing w:after="60" w:line="230"/>
+              <w:jc w:val="left"/>
+            </w:pPr>
+            <w:r>
+              <w:rPr>
+                <w:rFonts w:ascii="Arial" w:cs="Arial" w:eastAsia="Arial" w:hAnsi="Arial"/>
+                <w:b/>
+                <w:bCs/>
+                <w:sz w:val="16"/>
+                <w:szCs w:val="16"/>
+              </w:rPr>
+              <w:t xml:space="preserve">Problem: </w:t>
+            </w:r>
+            <w:r>
+              <w:rPr>
+                <w:rFonts w:ascii="Arial" w:cs="Arial" w:eastAsia="Arial" w:hAnsi="Arial"/>
+                <w:sz w:val="16"/>
+                <w:szCs w:val="16"/>
+              </w:rPr>
+              <w:t xml:space="preserve">A message "(product) has expired and cannot be sold" is displayed</w:t>
+            </w:r>
+          </w:p>
+          <w:p>
+            <w:pPr>
+              <w:spacing w:after="0" w:line="230"/>
+              <w:jc w:val="left"/>
+            </w:pPr>
+            <w:r>
+              <w:rPr>
+                <w:rFonts w:ascii="Arial" w:cs="Arial" w:eastAsia="Arial" w:hAnsi="Arial"/>
+                <w:b/>
+                <w:bCs/>
+                <w:sz w:val="16"/>
+                <w:szCs w:val="16"/>
+              </w:rPr>
+              <w:t xml:space="preserve">Solution: </w:t>
+            </w:r>
+            <w:r>
+              <w:rPr>
+                <w:rFonts w:ascii="Arial" w:cs="Arial" w:eastAsia="Arial" w:hAnsi="Arial"/>
+                <w:sz w:val="16"/>
+                <w:szCs w:val="16"/>
+              </w:rPr>
+              <w:t xml:space="preserve">Take it off the shelf and tell the administrator</w:t>
             </w:r>
           </w:p>
         </w:tc>
@@ -3981,17 +4146,50 @@
           </w:tcPr>
           <w:p>
             <w:pPr>
-              <w:spacing w:after="0" w:line="230"/>
-              <w:jc w:val="left"/>
-            </w:pPr>
-            <w:r>
-              <w:rPr>
-                <w:rFonts w:ascii="Arial" w:cs="Arial" w:eastAsia="Arial" w:hAnsi="Arial"/>
-                <w:color w:val="000000"/>
-                <w:sz w:val="16"/>
-                <w:szCs w:val="16"/>
-              </w:rPr>
-              <w:t xml:space="preserve">A message "(product) is sold out" is displayed and nothing is added</w:t>
+              <w:spacing w:after="60" w:line="230"/>
+              <w:jc w:val="left"/>
+            </w:pPr>
+            <w:r>
+              <w:rPr>
+                <w:rFonts w:ascii="Arial" w:cs="Arial" w:eastAsia="Arial" w:hAnsi="Arial"/>
+                <w:b/>
+                <w:bCs/>
+                <w:sz w:val="16"/>
+                <w:szCs w:val="16"/>
+              </w:rPr>
+              <w:t xml:space="preserve">Problem: </w:t>
+            </w:r>
+            <w:r>
+              <w:rPr>
+                <w:rFonts w:ascii="Arial" w:cs="Arial" w:eastAsia="Arial" w:hAnsi="Arial"/>
+                <w:sz w:val="16"/>
+                <w:szCs w:val="16"/>
+              </w:rPr>
+              <w:t xml:space="preserve">A message "(product) is sold out" is displayed</w:t>
+            </w:r>
+          </w:p>
+          <w:p>
+            <w:pPr>
+              <w:spacing w:after="0" w:line="230"/>
+              <w:jc w:val="left"/>
+            </w:pPr>
+            <w:r>
+              <w:rPr>
+                <w:rFonts w:ascii="Arial" w:cs="Arial" w:eastAsia="Arial" w:hAnsi="Arial"/>
+                <w:b/>
+                <w:bCs/>
+                <w:sz w:val="16"/>
+                <w:szCs w:val="16"/>
+              </w:rPr>
+              <w:t xml:space="preserve">Solution: </w:t>
+            </w:r>
+            <w:r>
+              <w:rPr>
+                <w:rFonts w:ascii="Arial" w:cs="Arial" w:eastAsia="Arial" w:hAnsi="Arial"/>
+                <w:sz w:val="16"/>
+                <w:szCs w:val="16"/>
+              </w:rPr>
+              <w:t xml:space="preserve">Tell the administrator to restock it</w:t>
             </w:r>
           </w:p>
         </w:tc>
@@ -4132,7 +4330,7 @@
                 <w:sz w:val="18"/>
                 <w:szCs w:val="18"/>
               </w:rPr>
-              <w:t xml:space="preserve">4.  COMPLETE A SALE</w:t>
+              <w:t xml:space="preserve">STEP 4: COMPLETE A SALE</w:t>
             </w:r>
           </w:p>
         </w:tc>
@@ -4305,7 +4503,7 @@
                 <w:sz w:val="16"/>
                 <w:szCs w:val="16"/>
               </w:rPr>
-              <w:t xml:space="preserve">Add items, enter enough Cash received, click Charge, then click Complete sale</w:t>
+              <w:t xml:space="preserve">Enter enough Cash received, click Charge, then click Complete sale</w:t>
             </w:r>
           </w:p>
         </w:tc>
@@ -4338,7 +4536,7 @@
                 <w:sz w:val="16"/>
                 <w:szCs w:val="16"/>
               </w:rPr>
-              <w:t xml:space="preserve">A message "Sale completed! Change: ₱(amount)" is displayed, the stock goes down and the receipt is shown</w:t>
+              <w:t xml:space="preserve">A message "Sale completed! Change: ₱(amount)" is displayed, the stock goes down and the receipt prints</w:t>
             </w:r>
           </w:p>
         </w:tc>
@@ -4610,7 +4808,7 @@
                 <w:sz w:val="16"/>
                 <w:szCs w:val="16"/>
               </w:rPr>
-              <w:t xml:space="preserve">Click Charge with nothing in the cart</w:t>
+              <w:t xml:space="preserve">Click Charge with an empty cart</w:t>
             </w:r>
           </w:p>
         </w:tc>
@@ -4633,17 +4831,50 @@
           </w:tcPr>
           <w:p>
             <w:pPr>
-              <w:spacing w:after="0" w:line="230"/>
-              <w:jc w:val="left"/>
-            </w:pPr>
-            <w:r>
-              <w:rPr>
-                <w:rFonts w:ascii="Arial" w:cs="Arial" w:eastAsia="Arial" w:hAnsi="Arial"/>
-                <w:color w:val="000000"/>
+              <w:spacing w:after="60" w:line="230"/>
+              <w:jc w:val="left"/>
+            </w:pPr>
+            <w:r>
+              <w:rPr>
+                <w:rFonts w:ascii="Arial" w:cs="Arial" w:eastAsia="Arial" w:hAnsi="Arial"/>
+                <w:b/>
+                <w:bCs/>
+                <w:sz w:val="16"/>
+                <w:szCs w:val="16"/>
+              </w:rPr>
+              <w:t xml:space="preserve">Problem: </w:t>
+            </w:r>
+            <w:r>
+              <w:rPr>
+                <w:rFonts w:ascii="Arial" w:cs="Arial" w:eastAsia="Arial" w:hAnsi="Arial"/>
                 <w:sz w:val="16"/>
                 <w:szCs w:val="16"/>
               </w:rPr>
               <w:t xml:space="preserve">A message "Cart is empty" is displayed</w:t>
+            </w:r>
+          </w:p>
+          <w:p>
+            <w:pPr>
+              <w:spacing w:after="0" w:line="230"/>
+              <w:jc w:val="left"/>
+            </w:pPr>
+            <w:r>
+              <w:rPr>
+                <w:rFonts w:ascii="Arial" w:cs="Arial" w:eastAsia="Arial" w:hAnsi="Arial"/>
+                <w:b/>
+                <w:bCs/>
+                <w:sz w:val="16"/>
+                <w:szCs w:val="16"/>
+              </w:rPr>
+              <w:t xml:space="preserve">Solution: </w:t>
+            </w:r>
+            <w:r>
+              <w:rPr>
+                <w:rFonts w:ascii="Arial" w:cs="Arial" w:eastAsia="Arial" w:hAnsi="Arial"/>
+                <w:sz w:val="16"/>
+                <w:szCs w:val="16"/>
+              </w:rPr>
+              <w:t xml:space="preserve">Add at least one product</w:t>
             </w:r>
           </w:p>
         </w:tc>
@@ -4915,7 +5146,7 @@
                 <w:sz w:val="16"/>
                 <w:szCs w:val="16"/>
               </w:rPr>
-              <w:t xml:space="preserve">Add an item, leave Cash received empty, then click Charge</w:t>
+              <w:t xml:space="preserve">Leave Cash received empty, then click Charge</w:t>
             </w:r>
           </w:p>
         </w:tc>
@@ -4938,17 +5169,50 @@
           </w:tcPr>
           <w:p>
             <w:pPr>
-              <w:spacing w:after="0" w:line="230"/>
-              <w:jc w:val="left"/>
-            </w:pPr>
-            <w:r>
-              <w:rPr>
-                <w:rFonts w:ascii="Arial" w:cs="Arial" w:eastAsia="Arial" w:hAnsi="Arial"/>
-                <w:color w:val="000000"/>
+              <w:spacing w:after="60" w:line="230"/>
+              <w:jc w:val="left"/>
+            </w:pPr>
+            <w:r>
+              <w:rPr>
+                <w:rFonts w:ascii="Arial" w:cs="Arial" w:eastAsia="Arial" w:hAnsi="Arial"/>
+                <w:b/>
+                <w:bCs/>
+                <w:sz w:val="16"/>
+                <w:szCs w:val="16"/>
+              </w:rPr>
+              <w:t xml:space="preserve">Problem: </w:t>
+            </w:r>
+            <w:r>
+              <w:rPr>
+                <w:rFonts w:ascii="Arial" w:cs="Arial" w:eastAsia="Arial" w:hAnsi="Arial"/>
                 <w:sz w:val="16"/>
                 <w:szCs w:val="16"/>
               </w:rPr>
               <w:t xml:space="preserve">A message "Enter the cash amount received" is displayed</w:t>
+            </w:r>
+          </w:p>
+          <w:p>
+            <w:pPr>
+              <w:spacing w:after="0" w:line="230"/>
+              <w:jc w:val="left"/>
+            </w:pPr>
+            <w:r>
+              <w:rPr>
+                <w:rFonts w:ascii="Arial" w:cs="Arial" w:eastAsia="Arial" w:hAnsi="Arial"/>
+                <w:b/>
+                <w:bCs/>
+                <w:sz w:val="16"/>
+                <w:szCs w:val="16"/>
+              </w:rPr>
+              <w:t xml:space="preserve">Solution: </w:t>
+            </w:r>
+            <w:r>
+              <w:rPr>
+                <w:rFonts w:ascii="Arial" w:cs="Arial" w:eastAsia="Arial" w:hAnsi="Arial"/>
+                <w:sz w:val="16"/>
+                <w:szCs w:val="16"/>
+              </w:rPr>
+              <w:t xml:space="preserve">Type the cash the customer gave</w:t>
             </w:r>
           </w:p>
         </w:tc>
@@ -5220,7 +5484,7 @@
                 <w:sz w:val="16"/>
                 <w:szCs w:val="16"/>
               </w:rPr>
-              <w:t xml:space="preserve">Enter less Cash received than the total, then click Charge</w:t>
+              <w:t xml:space="preserve">Enter less cash than the total, then click Charge</w:t>
             </w:r>
           </w:p>
         </w:tc>
@@ -5243,17 +5507,50 @@
           </w:tcPr>
           <w:p>
             <w:pPr>
-              <w:spacing w:after="0" w:line="230"/>
-              <w:jc w:val="left"/>
-            </w:pPr>
-            <w:r>
-              <w:rPr>
-                <w:rFonts w:ascii="Arial" w:cs="Arial" w:eastAsia="Arial" w:hAnsi="Arial"/>
-                <w:color w:val="000000"/>
-                <w:sz w:val="16"/>
-                <w:szCs w:val="16"/>
-              </w:rPr>
-              <w:t xml:space="preserve">A message "Insufficient cash — customer gave less than the total" is displayed and the sale is not made</w:t>
+              <w:spacing w:after="60" w:line="230"/>
+              <w:jc w:val="left"/>
+            </w:pPr>
+            <w:r>
+              <w:rPr>
+                <w:rFonts w:ascii="Arial" w:cs="Arial" w:eastAsia="Arial" w:hAnsi="Arial"/>
+                <w:b/>
+                <w:bCs/>
+                <w:sz w:val="16"/>
+                <w:szCs w:val="16"/>
+              </w:rPr>
+              <w:t xml:space="preserve">Problem: </w:t>
+            </w:r>
+            <w:r>
+              <w:rPr>
+                <w:rFonts w:ascii="Arial" w:cs="Arial" w:eastAsia="Arial" w:hAnsi="Arial"/>
+                <w:sz w:val="16"/>
+                <w:szCs w:val="16"/>
+              </w:rPr>
+              <w:t xml:space="preserve">A message "Insufficient cash — customer gave less than the total" is displayed</w:t>
+            </w:r>
+          </w:p>
+          <w:p>
+            <w:pPr>
+              <w:spacing w:after="0" w:line="230"/>
+              <w:jc w:val="left"/>
+            </w:pPr>
+            <w:r>
+              <w:rPr>
+                <w:rFonts w:ascii="Arial" w:cs="Arial" w:eastAsia="Arial" w:hAnsi="Arial"/>
+                <w:b/>
+                <w:bCs/>
+                <w:sz w:val="16"/>
+                <w:szCs w:val="16"/>
+              </w:rPr>
+              <w:t xml:space="preserve">Solution: </w:t>
+            </w:r>
+            <w:r>
+              <w:rPr>
+                <w:rFonts w:ascii="Arial" w:cs="Arial" w:eastAsia="Arial" w:hAnsi="Arial"/>
+                <w:sz w:val="16"/>
+                <w:szCs w:val="16"/>
+              </w:rPr>
+              <w:t xml:space="preserve">Ask for more cash, or remove an item</w:t>
             </w:r>
           </w:p>
         </w:tc>
@@ -5525,7 +5822,7 @@
                 <w:sz w:val="16"/>
                 <w:szCs w:val="16"/>
               </w:rPr>
-              <w:t xml:space="preserve">Enter a Discount above the limit set by the administrator (for example 50)</w:t>
+              <w:t xml:space="preserve">Enter a Discount above the limit, for example 50</w:t>
             </w:r>
           </w:p>
         </w:tc>
@@ -5548,17 +5845,50 @@
           </w:tcPr>
           <w:p>
             <w:pPr>
-              <w:spacing w:after="0" w:line="230"/>
-              <w:jc w:val="left"/>
-            </w:pPr>
-            <w:r>
-              <w:rPr>
-                <w:rFonts w:ascii="Arial" w:cs="Arial" w:eastAsia="Arial" w:hAnsi="Arial"/>
-                <w:color w:val="000000"/>
+              <w:spacing w:after="60" w:line="230"/>
+              <w:jc w:val="left"/>
+            </w:pPr>
+            <w:r>
+              <w:rPr>
+                <w:rFonts w:ascii="Arial" w:cs="Arial" w:eastAsia="Arial" w:hAnsi="Arial"/>
+                <w:b/>
+                <w:bCs/>
+                <w:sz w:val="16"/>
+                <w:szCs w:val="16"/>
+              </w:rPr>
+              <w:t xml:space="preserve">Problem: </w:t>
+            </w:r>
+            <w:r>
+              <w:rPr>
+                <w:rFonts w:ascii="Arial" w:cs="Arial" w:eastAsia="Arial" w:hAnsi="Arial"/>
                 <w:sz w:val="16"/>
                 <w:szCs w:val="16"/>
               </w:rPr>
               <w:t xml:space="preserve">A message "The largest discount allowed is (limit)%" is displayed and the discount is lowered to the limit</w:t>
+            </w:r>
+          </w:p>
+          <w:p>
+            <w:pPr>
+              <w:spacing w:after="0" w:line="230"/>
+              <w:jc w:val="left"/>
+            </w:pPr>
+            <w:r>
+              <w:rPr>
+                <w:rFonts w:ascii="Arial" w:cs="Arial" w:eastAsia="Arial" w:hAnsi="Arial"/>
+                <w:b/>
+                <w:bCs/>
+                <w:sz w:val="16"/>
+                <w:szCs w:val="16"/>
+              </w:rPr>
+              <w:t xml:space="preserve">Solution: </w:t>
+            </w:r>
+            <w:r>
+              <w:rPr>
+                <w:rFonts w:ascii="Arial" w:cs="Arial" w:eastAsia="Arial" w:hAnsi="Arial"/>
+                <w:sz w:val="16"/>
+                <w:szCs w:val="16"/>
+              </w:rPr>
+              <w:t xml:space="preserve">Give a discount within the limit</w:t>
             </w:r>
           </w:p>
         </w:tc>
@@ -5853,17 +6183,50 @@
           </w:tcPr>
           <w:p>
             <w:pPr>
-              <w:spacing w:after="0" w:line="230"/>
-              <w:jc w:val="left"/>
-            </w:pPr>
-            <w:r>
-              <w:rPr>
-                <w:rFonts w:ascii="Arial" w:cs="Arial" w:eastAsia="Arial" w:hAnsi="Arial"/>
-                <w:color w:val="000000"/>
+              <w:spacing w:after="60" w:line="230"/>
+              <w:jc w:val="left"/>
+            </w:pPr>
+            <w:r>
+              <w:rPr>
+                <w:rFonts w:ascii="Arial" w:cs="Arial" w:eastAsia="Arial" w:hAnsi="Arial"/>
+                <w:b/>
+                <w:bCs/>
+                <w:sz w:val="16"/>
+                <w:szCs w:val="16"/>
+              </w:rPr>
+              <w:t xml:space="preserve">Problem: </w:t>
+            </w:r>
+            <w:r>
+              <w:rPr>
+                <w:rFonts w:ascii="Arial" w:cs="Arial" w:eastAsia="Arial" w:hAnsi="Arial"/>
                 <w:sz w:val="16"/>
                 <w:szCs w:val="16"/>
               </w:rPr>
               <w:t xml:space="preserve">Only one sale is recorded and the stock goes down once</w:t>
+            </w:r>
+          </w:p>
+          <w:p>
+            <w:pPr>
+              <w:spacing w:after="0" w:line="230"/>
+              <w:jc w:val="left"/>
+            </w:pPr>
+            <w:r>
+              <w:rPr>
+                <w:rFonts w:ascii="Arial" w:cs="Arial" w:eastAsia="Arial" w:hAnsi="Arial"/>
+                <w:b/>
+                <w:bCs/>
+                <w:sz w:val="16"/>
+                <w:szCs w:val="16"/>
+              </w:rPr>
+              <w:t xml:space="preserve">Solution: </w:t>
+            </w:r>
+            <w:r>
+              <w:rPr>
+                <w:rFonts w:ascii="Arial" w:cs="Arial" w:eastAsia="Arial" w:hAnsi="Arial"/>
+                <w:sz w:val="16"/>
+                <w:szCs w:val="16"/>
+              </w:rPr>
+              <w:t xml:space="preserve">No action</w:t>
             </w:r>
           </w:p>
         </w:tc>
@@ -6004,7 +6367,7 @@
                 <w:sz w:val="18"/>
                 <w:szCs w:val="18"/>
               </w:rPr>
-              <w:t xml:space="preserve">5.  CASH IN / OUT</w:t>
+              <w:t xml:space="preserve">STEP 5: CASH IN / OUT</w:t>
             </w:r>
           </w:p>
         </w:tc>
@@ -6177,7 +6540,7 @@
                 <w:sz w:val="16"/>
                 <w:szCs w:val="16"/>
               </w:rPr>
-              <w:t xml:space="preserve">Click Cash in / out, choose Taken out, enter 50 as the Amount and who took it and what for, click Record cash taken out, then click Record it</w:t>
+              <w:t xml:space="preserve">Click Cash in / out, choose Taken out, enter 50 and who took it and why, click Record cash taken out, then Record it</w:t>
             </w:r>
           </w:p>
         </w:tc>
@@ -6482,7 +6845,7 @@
                 <w:sz w:val="16"/>
                 <w:szCs w:val="16"/>
               </w:rPr>
-              <w:t xml:space="preserve">Click Cash in / out, leave Amount empty, then click Record cash taken out</w:t>
+              <w:t xml:space="preserve">Leave Amount empty, then click Record cash taken out</w:t>
             </w:r>
           </w:p>
         </w:tc>
@@ -6505,17 +6868,50 @@
           </w:tcPr>
           <w:p>
             <w:pPr>
-              <w:spacing w:after="0" w:line="230"/>
-              <w:jc w:val="left"/>
-            </w:pPr>
-            <w:r>
-              <w:rPr>
-                <w:rFonts w:ascii="Arial" w:cs="Arial" w:eastAsia="Arial" w:hAnsi="Arial"/>
-                <w:color w:val="000000"/>
+              <w:spacing w:after="60" w:line="230"/>
+              <w:jc w:val="left"/>
+            </w:pPr>
+            <w:r>
+              <w:rPr>
+                <w:rFonts w:ascii="Arial" w:cs="Arial" w:eastAsia="Arial" w:hAnsi="Arial"/>
+                <w:b/>
+                <w:bCs/>
+                <w:sz w:val="16"/>
+                <w:szCs w:val="16"/>
+              </w:rPr>
+              <w:t xml:space="preserve">Problem: </w:t>
+            </w:r>
+            <w:r>
+              <w:rPr>
+                <w:rFonts w:ascii="Arial" w:cs="Arial" w:eastAsia="Arial" w:hAnsi="Arial"/>
                 <w:sz w:val="16"/>
                 <w:szCs w:val="16"/>
               </w:rPr>
               <w:t xml:space="preserve">A message "Enter the amount" is displayed</w:t>
+            </w:r>
+          </w:p>
+          <w:p>
+            <w:pPr>
+              <w:spacing w:after="0" w:line="230"/>
+              <w:jc w:val="left"/>
+            </w:pPr>
+            <w:r>
+              <w:rPr>
+                <w:rFonts w:ascii="Arial" w:cs="Arial" w:eastAsia="Arial" w:hAnsi="Arial"/>
+                <w:b/>
+                <w:bCs/>
+                <w:sz w:val="16"/>
+                <w:szCs w:val="16"/>
+              </w:rPr>
+              <w:t xml:space="preserve">Solution: </w:t>
+            </w:r>
+            <w:r>
+              <w:rPr>
+                <w:rFonts w:ascii="Arial" w:cs="Arial" w:eastAsia="Arial" w:hAnsi="Arial"/>
+                <w:sz w:val="16"/>
+                <w:szCs w:val="16"/>
+              </w:rPr>
+              <w:t xml:space="preserve">Type the amount</w:t>
             </w:r>
           </w:p>
         </w:tc>
@@ -6787,7 +7183,7 @@
                 <w:sz w:val="16"/>
                 <w:szCs w:val="16"/>
               </w:rPr>
-              <w:t xml:space="preserve">Enter an Amount but leave "Who took it, and what for" empty, then click Record cash taken out</w:t>
+              <w:t xml:space="preserve">Enter the amount but leave "Who took it, and what for" empty</w:t>
             </w:r>
           </w:p>
         </w:tc>
@@ -6810,17 +7206,50 @@
           </w:tcPr>
           <w:p>
             <w:pPr>
-              <w:spacing w:after="0" w:line="230"/>
-              <w:jc w:val="left"/>
-            </w:pPr>
-            <w:r>
-              <w:rPr>
-                <w:rFonts w:ascii="Arial" w:cs="Arial" w:eastAsia="Arial" w:hAnsi="Arial"/>
-                <w:color w:val="000000"/>
+              <w:spacing w:after="60" w:line="230"/>
+              <w:jc w:val="left"/>
+            </w:pPr>
+            <w:r>
+              <w:rPr>
+                <w:rFonts w:ascii="Arial" w:cs="Arial" w:eastAsia="Arial" w:hAnsi="Arial"/>
+                <w:b/>
+                <w:bCs/>
+                <w:sz w:val="16"/>
+                <w:szCs w:val="16"/>
+              </w:rPr>
+              <w:t xml:space="preserve">Problem: </w:t>
+            </w:r>
+            <w:r>
+              <w:rPr>
+                <w:rFonts w:ascii="Arial" w:cs="Arial" w:eastAsia="Arial" w:hAnsi="Arial"/>
                 <w:sz w:val="16"/>
                 <w:szCs w:val="16"/>
               </w:rPr>
               <w:t xml:space="preserve">A message "Say who took the cash and what for" is displayed</w:t>
+            </w:r>
+          </w:p>
+          <w:p>
+            <w:pPr>
+              <w:spacing w:after="0" w:line="230"/>
+              <w:jc w:val="left"/>
+            </w:pPr>
+            <w:r>
+              <w:rPr>
+                <w:rFonts w:ascii="Arial" w:cs="Arial" w:eastAsia="Arial" w:hAnsi="Arial"/>
+                <w:b/>
+                <w:bCs/>
+                <w:sz w:val="16"/>
+                <w:szCs w:val="16"/>
+              </w:rPr>
+              <w:t xml:space="preserve">Solution: </w:t>
+            </w:r>
+            <w:r>
+              <w:rPr>
+                <w:rFonts w:ascii="Arial" w:cs="Arial" w:eastAsia="Arial" w:hAnsi="Arial"/>
+                <w:sz w:val="16"/>
+                <w:szCs w:val="16"/>
+              </w:rPr>
+              <w:t xml:space="preserve">Type who took the cash and why</w:t>
             </w:r>
           </w:p>
         </w:tc>
@@ -7092,7 +7521,7 @@
                 <w:sz w:val="16"/>
                 <w:szCs w:val="16"/>
               </w:rPr>
-              <w:t xml:space="preserve">Take out more cash than the drawer holds (more than the starting cash plus cash sales), then confirm</w:t>
+              <w:t xml:space="preserve">Take out more cash than the drawer holds</w:t>
             </w:r>
           </w:p>
         </w:tc>
@@ -7115,17 +7544,50 @@
           </w:tcPr>
           <w:p>
             <w:pPr>
-              <w:spacing w:after="0" w:line="230"/>
-              <w:jc w:val="left"/>
-            </w:pPr>
-            <w:r>
-              <w:rPr>
-                <w:rFonts w:ascii="Arial" w:cs="Arial" w:eastAsia="Arial" w:hAnsi="Arial"/>
-                <w:color w:val="000000"/>
-                <w:sz w:val="16"/>
-                <w:szCs w:val="16"/>
-              </w:rPr>
-              <w:t xml:space="preserve">A message "That is more cash than the drawer should hold." is displayed and nothing is recorded</w:t>
+              <w:spacing w:after="60" w:line="230"/>
+              <w:jc w:val="left"/>
+            </w:pPr>
+            <w:r>
+              <w:rPr>
+                <w:rFonts w:ascii="Arial" w:cs="Arial" w:eastAsia="Arial" w:hAnsi="Arial"/>
+                <w:b/>
+                <w:bCs/>
+                <w:sz w:val="16"/>
+                <w:szCs w:val="16"/>
+              </w:rPr>
+              <w:t xml:space="preserve">Problem: </w:t>
+            </w:r>
+            <w:r>
+              <w:rPr>
+                <w:rFonts w:ascii="Arial" w:cs="Arial" w:eastAsia="Arial" w:hAnsi="Arial"/>
+                <w:sz w:val="16"/>
+                <w:szCs w:val="16"/>
+              </w:rPr>
+              <w:t xml:space="preserve">A message "That is more cash than the drawer should hold." is displayed</w:t>
+            </w:r>
+          </w:p>
+          <w:p>
+            <w:pPr>
+              <w:spacing w:after="0" w:line="230"/>
+              <w:jc w:val="left"/>
+            </w:pPr>
+            <w:r>
+              <w:rPr>
+                <w:rFonts w:ascii="Arial" w:cs="Arial" w:eastAsia="Arial" w:hAnsi="Arial"/>
+                <w:b/>
+                <w:bCs/>
+                <w:sz w:val="16"/>
+                <w:szCs w:val="16"/>
+              </w:rPr>
+              <w:t xml:space="preserve">Solution: </w:t>
+            </w:r>
+            <w:r>
+              <w:rPr>
+                <w:rFonts w:ascii="Arial" w:cs="Arial" w:eastAsia="Arial" w:hAnsi="Arial"/>
+                <w:sz w:val="16"/>
+                <w:szCs w:val="16"/>
+              </w:rPr>
+              <w:t xml:space="preserve">Count the drawer and enter the right amount</w:t>
             </w:r>
           </w:p>
         </w:tc>
@@ -7266,7 +7728,7 @@
                 <w:sz w:val="18"/>
                 <w:szCs w:val="18"/>
               </w:rPr>
-              <w:t xml:space="preserve">6.  ASK FOR VOID</w:t>
+              <w:t xml:space="preserve">STEP 6: ASK FOR VOID</w:t>
             </w:r>
           </w:p>
         </w:tc>
@@ -7472,7 +7934,7 @@
                 <w:sz w:val="16"/>
                 <w:szCs w:val="16"/>
               </w:rPr>
-              <w:t xml:space="preserve">A message "Sent to a manager" is displayed; the administrator sees the request under Void requests</w:t>
+              <w:t xml:space="preserve">A message "Sent to a manager" is displayed and the administrator sees it in Void requests</w:t>
             </w:r>
           </w:p>
         </w:tc>
@@ -7744,7 +8206,7 @@
                 <w:sz w:val="16"/>
                 <w:szCs w:val="16"/>
               </w:rPr>
-              <w:t xml:space="preserve">Click Ask for void and leave the reason empty (or under 3 letters), then click Send request</w:t>
+              <w:t xml:space="preserve">Leave the reason empty, then click Send request</w:t>
             </w:r>
           </w:p>
         </w:tc>
@@ -7767,17 +8229,50 @@
           </w:tcPr>
           <w:p>
             <w:pPr>
-              <w:spacing w:after="0" w:line="230"/>
-              <w:jc w:val="left"/>
-            </w:pPr>
-            <w:r>
-              <w:rPr>
-                <w:rFonts w:ascii="Arial" w:cs="Arial" w:eastAsia="Arial" w:hAnsi="Arial"/>
-                <w:color w:val="000000"/>
-                <w:sz w:val="16"/>
-                <w:szCs w:val="16"/>
-              </w:rPr>
-              <w:t xml:space="preserve">A message "Say briefly what went wrong" is displayed and nothing is sent</w:t>
+              <w:spacing w:after="60" w:line="230"/>
+              <w:jc w:val="left"/>
+            </w:pPr>
+            <w:r>
+              <w:rPr>
+                <w:rFonts w:ascii="Arial" w:cs="Arial" w:eastAsia="Arial" w:hAnsi="Arial"/>
+                <w:b/>
+                <w:bCs/>
+                <w:sz w:val="16"/>
+                <w:szCs w:val="16"/>
+              </w:rPr>
+              <w:t xml:space="preserve">Problem: </w:t>
+            </w:r>
+            <w:r>
+              <w:rPr>
+                <w:rFonts w:ascii="Arial" w:cs="Arial" w:eastAsia="Arial" w:hAnsi="Arial"/>
+                <w:sz w:val="16"/>
+                <w:szCs w:val="16"/>
+              </w:rPr>
+              <w:t xml:space="preserve">A message "Say briefly what went wrong" is displayed</w:t>
+            </w:r>
+          </w:p>
+          <w:p>
+            <w:pPr>
+              <w:spacing w:after="0" w:line="230"/>
+              <w:jc w:val="left"/>
+            </w:pPr>
+            <w:r>
+              <w:rPr>
+                <w:rFonts w:ascii="Arial" w:cs="Arial" w:eastAsia="Arial" w:hAnsi="Arial"/>
+                <w:b/>
+                <w:bCs/>
+                <w:sz w:val="16"/>
+                <w:szCs w:val="16"/>
+              </w:rPr>
+              <w:t xml:space="preserve">Solution: </w:t>
+            </w:r>
+            <w:r>
+              <w:rPr>
+                <w:rFonts w:ascii="Arial" w:cs="Arial" w:eastAsia="Arial" w:hAnsi="Arial"/>
+                <w:sz w:val="16"/>
+                <w:szCs w:val="16"/>
+              </w:rPr>
+              <w:t xml:space="preserve">Type what went wrong</w:t>
             </w:r>
           </w:p>
         </w:tc>
@@ -8072,17 +8567,50 @@
           </w:tcPr>
           <w:p>
             <w:pPr>
-              <w:spacing w:after="0" w:line="230"/>
-              <w:jc w:val="left"/>
-            </w:pPr>
-            <w:r>
-              <w:rPr>
-                <w:rFonts w:ascii="Arial" w:cs="Arial" w:eastAsia="Arial" w:hAnsi="Arial"/>
-                <w:color w:val="000000"/>
-                <w:sz w:val="16"/>
-                <w:szCs w:val="16"/>
-              </w:rPr>
-              <w:t xml:space="preserve">The sale has no Ask for void button, so it cannot be requested twice</w:t>
+              <w:spacing w:after="60" w:line="230"/>
+              <w:jc w:val="left"/>
+            </w:pPr>
+            <w:r>
+              <w:rPr>
+                <w:rFonts w:ascii="Arial" w:cs="Arial" w:eastAsia="Arial" w:hAnsi="Arial"/>
+                <w:b/>
+                <w:bCs/>
+                <w:sz w:val="16"/>
+                <w:szCs w:val="16"/>
+              </w:rPr>
+              <w:t xml:space="preserve">Problem: </w:t>
+            </w:r>
+            <w:r>
+              <w:rPr>
+                <w:rFonts w:ascii="Arial" w:cs="Arial" w:eastAsia="Arial" w:hAnsi="Arial"/>
+                <w:sz w:val="16"/>
+                <w:szCs w:val="16"/>
+              </w:rPr>
+              <w:t xml:space="preserve">It has no Ask for void button</w:t>
+            </w:r>
+          </w:p>
+          <w:p>
+            <w:pPr>
+              <w:spacing w:after="0" w:line="230"/>
+              <w:jc w:val="left"/>
+            </w:pPr>
+            <w:r>
+              <w:rPr>
+                <w:rFonts w:ascii="Arial" w:cs="Arial" w:eastAsia="Arial" w:hAnsi="Arial"/>
+                <w:b/>
+                <w:bCs/>
+                <w:sz w:val="16"/>
+                <w:szCs w:val="16"/>
+              </w:rPr>
+              <w:t xml:space="preserve">Solution: </w:t>
+            </w:r>
+            <w:r>
+              <w:rPr>
+                <w:rFonts w:ascii="Arial" w:cs="Arial" w:eastAsia="Arial" w:hAnsi="Arial"/>
+                <w:sz w:val="16"/>
+                <w:szCs w:val="16"/>
+              </w:rPr>
+              <w:t xml:space="preserve">No action: the request is waiting for the administrator</w:t>
             </w:r>
           </w:p>
         </w:tc>
@@ -8223,7 +8751,7 @@
                 <w:sz w:val="18"/>
                 <w:szCs w:val="18"/>
               </w:rPr>
-              <w:t xml:space="preserve">7.  END OF DAY</w:t>
+              <w:t xml:space="preserve">STEP 7: END OF DAY AND LOGOUT</w:t>
             </w:r>
           </w:p>
         </w:tc>
@@ -8429,7 +8957,7 @@
                 <w:sz w:val="16"/>
                 <w:szCs w:val="16"/>
               </w:rPr>
-              <w:t xml:space="preserve">"Balanced ✓", "Over by ₱(amount)" or "Short by ₱(amount)" is shown and the count is saved</w:t>
+              <w:t xml:space="preserve">"Balanced" with a tick, "Over by ₱(amount)" or "Short by ₱(amount)" is shown and the count is saved</w:t>
             </w:r>
           </w:p>
         </w:tc>
@@ -8701,7 +9229,7 @@
                 <w:sz w:val="16"/>
                 <w:szCs w:val="16"/>
               </w:rPr>
-              <w:t xml:space="preserve">Click End of day, leave the cash counted empty, then click Save count and close drawer</w:t>
+              <w:t xml:space="preserve">Leave the cash counted empty, then click Save count and close drawer</w:t>
             </w:r>
           </w:p>
         </w:tc>
@@ -8724,17 +9252,50 @@
           </w:tcPr>
           <w:p>
             <w:pPr>
-              <w:spacing w:after="0" w:line="230"/>
-              <w:jc w:val="left"/>
-            </w:pPr>
-            <w:r>
-              <w:rPr>
-                <w:rFonts w:ascii="Arial" w:cs="Arial" w:eastAsia="Arial" w:hAnsi="Arial"/>
-                <w:color w:val="000000"/>
-                <w:sz w:val="16"/>
-                <w:szCs w:val="16"/>
-              </w:rPr>
-              <w:t xml:space="preserve">A message "Enter the cash counted in the drawer" is displayed and the drawer stays open</w:t>
+              <w:spacing w:after="60" w:line="230"/>
+              <w:jc w:val="left"/>
+            </w:pPr>
+            <w:r>
+              <w:rPr>
+                <w:rFonts w:ascii="Arial" w:cs="Arial" w:eastAsia="Arial" w:hAnsi="Arial"/>
+                <w:b/>
+                <w:bCs/>
+                <w:sz w:val="16"/>
+                <w:szCs w:val="16"/>
+              </w:rPr>
+              <w:t xml:space="preserve">Problem: </w:t>
+            </w:r>
+            <w:r>
+              <w:rPr>
+                <w:rFonts w:ascii="Arial" w:cs="Arial" w:eastAsia="Arial" w:hAnsi="Arial"/>
+                <w:sz w:val="16"/>
+                <w:szCs w:val="16"/>
+              </w:rPr>
+              <w:t xml:space="preserve">A message "Enter the cash counted in the drawer" is displayed</w:t>
+            </w:r>
+          </w:p>
+          <w:p>
+            <w:pPr>
+              <w:spacing w:after="0" w:line="230"/>
+              <w:jc w:val="left"/>
+            </w:pPr>
+            <w:r>
+              <w:rPr>
+                <w:rFonts w:ascii="Arial" w:cs="Arial" w:eastAsia="Arial" w:hAnsi="Arial"/>
+                <w:b/>
+                <w:bCs/>
+                <w:sz w:val="16"/>
+                <w:szCs w:val="16"/>
+              </w:rPr>
+              <w:t xml:space="preserve">Solution: </w:t>
+            </w:r>
+            <w:r>
+              <w:rPr>
+                <w:rFonts w:ascii="Arial" w:cs="Arial" w:eastAsia="Arial" w:hAnsi="Arial"/>
+                <w:sz w:val="16"/>
+                <w:szCs w:val="16"/>
+              </w:rPr>
+              <w:t xml:space="preserve">Count the drawer and type the amount</w:t>
             </w:r>
           </w:p>
         </w:tc>
@@ -9029,17 +9590,50 @@
           </w:tcPr>
           <w:p>
             <w:pPr>
-              <w:spacing w:after="0" w:line="230"/>
-              <w:jc w:val="left"/>
-            </w:pPr>
-            <w:r>
-              <w:rPr>
-                <w:rFonts w:ascii="Arial" w:cs="Arial" w:eastAsia="Arial" w:hAnsi="Arial"/>
-                <w:color w:val="000000"/>
-                <w:sz w:val="16"/>
-                <w:szCs w:val="16"/>
-              </w:rPr>
-              <w:t xml:space="preserve">A message "Your drawer is closed for today" is displayed and nothing is added</w:t>
+              <w:spacing w:after="60" w:line="230"/>
+              <w:jc w:val="left"/>
+            </w:pPr>
+            <w:r>
+              <w:rPr>
+                <w:rFonts w:ascii="Arial" w:cs="Arial" w:eastAsia="Arial" w:hAnsi="Arial"/>
+                <w:b/>
+                <w:bCs/>
+                <w:sz w:val="16"/>
+                <w:szCs w:val="16"/>
+              </w:rPr>
+              <w:t xml:space="preserve">Problem: </w:t>
+            </w:r>
+            <w:r>
+              <w:rPr>
+                <w:rFonts w:ascii="Arial" w:cs="Arial" w:eastAsia="Arial" w:hAnsi="Arial"/>
+                <w:sz w:val="16"/>
+                <w:szCs w:val="16"/>
+              </w:rPr>
+              <w:t xml:space="preserve">A message "Your drawer is closed for today" is displayed</w:t>
+            </w:r>
+          </w:p>
+          <w:p>
+            <w:pPr>
+              <w:spacing w:after="0" w:line="230"/>
+              <w:jc w:val="left"/>
+            </w:pPr>
+            <w:r>
+              <w:rPr>
+                <w:rFonts w:ascii="Arial" w:cs="Arial" w:eastAsia="Arial" w:hAnsi="Arial"/>
+                <w:b/>
+                <w:bCs/>
+                <w:sz w:val="16"/>
+                <w:szCs w:val="16"/>
+              </w:rPr>
+              <w:t xml:space="preserve">Solution: </w:t>
+            </w:r>
+            <w:r>
+              <w:rPr>
+                <w:rFonts w:ascii="Arial" w:cs="Arial" w:eastAsia="Arial" w:hAnsi="Arial"/>
+                <w:sz w:val="16"/>
+                <w:szCs w:val="16"/>
+              </w:rPr>
+              <w:t xml:space="preserve">Wait for the next day, or ask the administrator to reopen the count</w:t>
             </w:r>
           </w:p>
         </w:tc>
@@ -9210,7 +9804,7 @@
                 <w:sz w:val="16"/>
                 <w:szCs w:val="16"/>
               </w:rPr>
-              <w:t xml:space="preserve">7.1c</w:t>
+              <w:t xml:space="preserve">7.2</w:t>
             </w:r>
           </w:p>
         </w:tc>
@@ -9239,13 +9833,13 @@
             <w:r>
               <w:rPr>
                 <w:rFonts w:ascii="Arial" w:cs="Arial" w:eastAsia="Arial" w:hAnsi="Arial"/>
-                <w:b w:val="false"/>
-                <w:bCs w:val="false"/>
-                <w:color w:val="000000"/>
-                <w:sz w:val="16"/>
-                <w:szCs w:val="16"/>
-              </w:rPr>
-              <w:t xml:space="preserve">Sad case</w:t>
+                <w:b/>
+                <w:bCs/>
+                <w:color w:val="000000"/>
+                <w:sz w:val="16"/>
+                <w:szCs w:val="16"/>
+              </w:rPr>
+              <w:t xml:space="preserve">Happy case</w:t>
             </w:r>
           </w:p>
         </w:tc>
@@ -9311,7 +9905,7 @@
                 <w:sz w:val="16"/>
                 <w:szCs w:val="16"/>
               </w:rPr>
-              <w:t xml:space="preserve">After the count is saved, click Cash in / out</w:t>
+              <w:t xml:space="preserve">Click Logout, then click Yes, Logout</w:t>
             </w:r>
           </w:p>
         </w:tc>
@@ -9344,7 +9938,7 @@
                 <w:sz w:val="16"/>
                 <w:szCs w:val="16"/>
               </w:rPr>
-              <w:t xml:space="preserve">The window says "Today's cash count is already recorded, so nothing more can be added for today."</w:t>
+              <w:t xml:space="preserve">The Sign in page opens</w:t>
             </w:r>
           </w:p>
         </w:tc>
@@ -9462,115 +10056,115 @@
           <w:sz w:val="24"/>
           <w:szCs w:val="24"/>
         </w:rPr>
-        <w:t xml:space="preserve">How to use this plan</w:t>
+        <w:t xml:space="preserve">How to use this script</w:t>
       </w:r>
     </w:p>
     <w:p>
       <w:pPr>
-        <w:spacing w:after="60" w:line="250"/>
+        <w:spacing w:after="90" w:line="260"/>
       </w:pPr>
       <w:r>
         <w:rPr>
           <w:rFonts w:ascii="Arial" w:cs="Arial" w:eastAsia="Arial" w:hAnsi="Arial"/>
-          <w:sz w:val="17"/>
-          <w:szCs w:val="17"/>
+          <w:sz w:val="18"/>
+          <w:szCs w:val="18"/>
         </w:rPr>
-        <w:t xml:space="preserve">Each scenario starts with a happy case (the user does it the right way, numbered 1.1, 1.2 …) followed by its sad cases (the user makes a mistake, leaves something out, types the wrong kind of value or tries something the role may not do, numbered 1.1a, 1.1b …). For every sad case the expected result is the exact message the system shows, so the tester can compare it word for word.</w:t>
+        <w:t xml:space="preserve">Follow the steps from top to bottom: each step starts where the one before ended, from signing in to logging out. Every happy case (numbered 1.1, 1.2 …) is followed by its sad cases (1.1a, 1.1b …). For a sad case the expected result gives the Problem first (the exact message the system shows) and then the Solution (what the user does to fix it).</w:t>
       </w:r>
     </w:p>
     <w:p>
       <w:pPr>
-        <w:spacing w:after="60" w:line="250"/>
+        <w:spacing w:after="90" w:line="260"/>
       </w:pPr>
       <w:r>
         <w:rPr>
           <w:rFonts w:ascii="Arial" w:cs="Arial" w:eastAsia="Arial" w:hAnsi="Arial"/>
-          <w:sz w:val="17"/>
-          <w:szCs w:val="17"/>
+          <w:sz w:val="18"/>
+          <w:szCs w:val="18"/>
         </w:rPr>
-        <w:t xml:space="preserve">Words in brackets, such as (product) or (amount), stand for the value on the tester's screen. A "tooltip" is the small box the web browser shows next to a field that has to be filled in; its wording comes from the browser, not from FETCH.</w:t>
+        <w:t xml:space="preserve">Words in brackets, such as (product) or (amount), stand for the value on the screen. A tooltip is the small box the web browser shows beside a field that must be filled in; its wording comes from the browser.</w:t>
       </w:r>
     </w:p>
     <w:p>
       <w:pPr>
-        <w:spacing w:after="60" w:line="250"/>
+        <w:spacing w:after="90" w:line="260"/>
       </w:pPr>
       <w:r>
         <w:rPr>
           <w:rFonts w:ascii="Arial" w:cs="Arial" w:eastAsia="Arial" w:hAnsi="Arial"/>
-          <w:sz w:val="17"/>
-          <w:szCs w:val="17"/>
+          <w:sz w:val="18"/>
+          <w:szCs w:val="18"/>
         </w:rPr>
         <w:t xml:space="preserve">Mark STATUS with the colours in the legend: green Passed, red Failed, amber In Progress, blank Open.</w:t>
       </w:r>
     </w:p>
     <w:p>
       <w:pPr>
-        <w:spacing w:after="80" w:before="160"/>
+        <w:spacing w:after="80" w:before="140"/>
       </w:pPr>
       <w:r>
         <w:rPr>
           <w:rFonts w:ascii="Arial" w:cs="Arial" w:eastAsia="Arial" w:hAnsi="Arial"/>
           <w:b/>
           <w:bCs/>
-          <w:sz w:val="22"/>
-          <w:szCs w:val="22"/>
+          <w:sz w:val="21"/>
+          <w:szCs w:val="21"/>
         </w:rPr>
         <w:t xml:space="preserve">Set up before testing</w:t>
       </w:r>
     </w:p>
     <w:p>
       <w:pPr>
-        <w:spacing w:after="40" w:line="250"/>
+        <w:spacing w:after="50" w:line="260"/>
         <w:ind w:left="360" w:hanging="220"/>
       </w:pPr>
       <w:r>
         <w:rPr>
           <w:rFonts w:ascii="Arial" w:cs="Arial" w:eastAsia="Arial" w:hAnsi="Arial"/>
-          <w:sz w:val="17"/>
-          <w:szCs w:val="17"/>
+          <w:sz w:val="18"/>
+          <w:szCs w:val="18"/>
         </w:rPr>
         <w:t xml:space="preserve">•  A cashier account that has not yet entered today's starting cash.</w:t>
       </w:r>
     </w:p>
     <w:p>
       <w:pPr>
-        <w:spacing w:after="40" w:line="250"/>
+        <w:spacing w:after="50" w:line="260"/>
         <w:ind w:left="360" w:hanging="220"/>
       </w:pPr>
       <w:r>
         <w:rPr>
           <w:rFonts w:ascii="Arial" w:cs="Arial" w:eastAsia="Arial" w:hAnsi="Arial"/>
-          <w:sz w:val="17"/>
-          <w:szCs w:val="17"/>
+          <w:sz w:val="18"/>
+          <w:szCs w:val="18"/>
         </w:rPr>
         <w:t xml:space="preserve">•  Products with barcodes: one in stock, one expired and one sold out.</w:t>
       </w:r>
     </w:p>
     <w:p>
       <w:pPr>
-        <w:spacing w:after="40" w:line="250"/>
+        <w:spacing w:after="50" w:line="260"/>
         <w:ind w:left="360" w:hanging="220"/>
       </w:pPr>
       <w:r>
         <w:rPr>
           <w:rFonts w:ascii="Arial" w:cs="Arial" w:eastAsia="Arial" w:hAnsi="Arial"/>
-          <w:sz w:val="17"/>
-          <w:szCs w:val="17"/>
+          <w:sz w:val="18"/>
+          <w:szCs w:val="18"/>
         </w:rPr>
         <w:t xml:space="preserve">•  The discount limit set by the administrator (Settings, Preferences).</w:t>
       </w:r>
     </w:p>
     <w:p>
       <w:pPr>
-        <w:spacing w:after="40" w:line="250"/>
+        <w:spacing w:after="50" w:line="260"/>
         <w:ind w:left="360" w:hanging="220"/>
       </w:pPr>
       <w:r>
         <w:rPr>
           <w:rFonts w:ascii="Arial" w:cs="Arial" w:eastAsia="Arial" w:hAnsi="Arial"/>
-          <w:sz w:val="17"/>
-          <w:szCs w:val="17"/>
+          <w:sz w:val="18"/>
+          <w:szCs w:val="18"/>
         </w:rPr>
         <w:t xml:space="preserve">•  For the last end-of-day cases, run them after the count is saved: they show what a closed drawer does.</w:t>
       </w:r>

</xml_diff>